<commit_message>
feat: add README.md for finally
</commit_message>
<xml_diff>
--- a/finally/docs/report_computer_vision.docx
+++ b/finally/docs/report_computer_vision.docx
@@ -388,17 +388,6 @@
                                 <w:szCs w:val="30"/>
                               </w:rPr>
                             </w:pPr>
-                          </w:p>
-                          <w:p>
-                            <w:pPr>
-                              <w:spacing w:before="360" w:line="276" w:lineRule="auto"/>
-                              <w:rPr>
-                                <w:rFonts w:cs="Times New Roman"/>
-                                <w:b/>
-                                <w:sz w:val="30"/>
-                                <w:szCs w:val="30"/>
-                              </w:rPr>
-                            </w:pPr>
                             <w:r>
                               <w:rPr>
                                 <w:rFonts w:cs="Times New Roman"/>
@@ -431,9 +420,11 @@
                           <w:p>
                             <w:pPr>
                               <w:spacing w:line="276" w:lineRule="auto"/>
+                              <w:jc w:val="center"/>
                               <w:rPr>
                                 <w:rFonts w:cs="Times New Roman"/>
                                 <w:b/>
+                                <w:bCs/>
                                 <w:sz w:val="28"/>
                                 <w:szCs w:val="28"/>
                               </w:rPr>
@@ -449,7 +440,6 @@
                                 <w:bCs/>
                                 <w:sz w:val="28"/>
                                 <w:szCs w:val="28"/>
-                                <w:lang w:val="vi-VN"/>
                               </w:rPr>
                             </w:pPr>
                           </w:p>
@@ -1576,17 +1566,6 @@
                           <w:szCs w:val="30"/>
                         </w:rPr>
                       </w:pPr>
-                    </w:p>
-                    <w:p>
-                      <w:pPr>
-                        <w:spacing w:before="360" w:line="276" w:lineRule="auto"/>
-                        <w:rPr>
-                          <w:rFonts w:cs="Times New Roman"/>
-                          <w:b/>
-                          <w:sz w:val="30"/>
-                          <w:szCs w:val="30"/>
-                        </w:rPr>
-                      </w:pPr>
                       <w:r>
                         <w:rPr>
                           <w:rFonts w:cs="Times New Roman"/>
@@ -1619,9 +1598,11 @@
                     <w:p>
                       <w:pPr>
                         <w:spacing w:line="276" w:lineRule="auto"/>
+                        <w:jc w:val="center"/>
                         <w:rPr>
                           <w:rFonts w:cs="Times New Roman"/>
                           <w:b/>
+                          <w:bCs/>
                           <w:sz w:val="28"/>
                           <w:szCs w:val="28"/>
                         </w:rPr>
@@ -1637,7 +1618,6 @@
                           <w:bCs/>
                           <w:sz w:val="28"/>
                           <w:szCs w:val="28"/>
-                          <w:lang w:val="vi-VN"/>
                         </w:rPr>
                       </w:pPr>
                     </w:p>
@@ -2483,7 +2463,7 @@
           <w:r>
             <w:fldChar w:fldCharType="separate"/>
           </w:r>
-          <w:hyperlink w:anchor="_Toc231052485" w:history="1">
+          <w:hyperlink w:anchor="_Toc231054007" w:history="1">
             <w:r>
               <w:rPr>
                 <w:rStyle w:val="Hyperlink"/>
@@ -2511,7 +2491,7 @@
                 <w:noProof/>
                 <w:webHidden/>
               </w:rPr>
-              <w:instrText xml:space="preserve"> PAGEREF _Toc231052485 \h </w:instrText>
+              <w:instrText xml:space="preserve"> PAGEREF _Toc231054007 \h </w:instrText>
             </w:r>
             <w:r>
               <w:rPr>
@@ -2556,7 +2536,7 @@
               <w14:ligatures w14:val="standardContextual"/>
             </w:rPr>
           </w:pPr>
-          <w:hyperlink w:anchor="_Toc231052486" w:history="1">
+          <w:hyperlink w:anchor="_Toc231054008" w:history="1">
             <w:r>
               <w:rPr>
                 <w:rStyle w:val="Hyperlink"/>
@@ -2584,7 +2564,7 @@
                 <w:noProof/>
                 <w:webHidden/>
               </w:rPr>
-              <w:instrText xml:space="preserve"> PAGEREF _Toc231052486 \h </w:instrText>
+              <w:instrText xml:space="preserve"> PAGEREF _Toc231054008 \h </w:instrText>
             </w:r>
             <w:r>
               <w:rPr>
@@ -2629,7 +2609,7 @@
               <w14:ligatures w14:val="standardContextual"/>
             </w:rPr>
           </w:pPr>
-          <w:hyperlink w:anchor="_Toc231052487" w:history="1">
+          <w:hyperlink w:anchor="_Toc231054009" w:history="1">
             <w:r>
               <w:rPr>
                 <w:rStyle w:val="Hyperlink"/>
@@ -2656,7 +2636,7 @@
                 <w:noProof/>
                 <w:webHidden/>
               </w:rPr>
-              <w:instrText xml:space="preserve"> PAGEREF _Toc231052487 \h </w:instrText>
+              <w:instrText xml:space="preserve"> PAGEREF _Toc231054009 \h </w:instrText>
             </w:r>
             <w:r>
               <w:rPr>
@@ -2701,7 +2681,7 @@
               <w14:ligatures w14:val="standardContextual"/>
             </w:rPr>
           </w:pPr>
-          <w:hyperlink w:anchor="_Toc231052488" w:history="1">
+          <w:hyperlink w:anchor="_Toc231054010" w:history="1">
             <w:r>
               <w:rPr>
                 <w:rStyle w:val="Hyperlink"/>
@@ -2728,7 +2708,7 @@
                 <w:noProof/>
                 <w:webHidden/>
               </w:rPr>
-              <w:instrText xml:space="preserve"> PAGEREF _Toc231052488 \h </w:instrText>
+              <w:instrText xml:space="preserve"> PAGEREF _Toc231054010 \h </w:instrText>
             </w:r>
             <w:r>
               <w:rPr>
@@ -2773,13 +2753,13 @@
               <w14:ligatures w14:val="standardContextual"/>
             </w:rPr>
           </w:pPr>
-          <w:hyperlink w:anchor="_Toc231052489" w:history="1">
+          <w:hyperlink w:anchor="_Toc231054011" w:history="1">
             <w:r>
               <w:rPr>
                 <w:rStyle w:val="Hyperlink"/>
                 <w:noProof/>
               </w:rPr>
-              <w:t>1. MÔ TẢ VẤN ĐỀ CỦA BÀI TOÁN</w:t>
+              <w:t>CHƯƠNG 1. MÔ TẢ VẤN ĐỀ CỦA BÀI TOÁN</w:t>
             </w:r>
             <w:r>
               <w:rPr>
@@ -2800,7 +2780,7 @@
                 <w:noProof/>
                 <w:webHidden/>
               </w:rPr>
-              <w:instrText xml:space="preserve"> PAGEREF _Toc231052489 \h </w:instrText>
+              <w:instrText xml:space="preserve"> PAGEREF _Toc231054011 \h </w:instrText>
             </w:r>
             <w:r>
               <w:rPr>
@@ -2845,7 +2825,7 @@
               <w14:ligatures w14:val="standardContextual"/>
             </w:rPr>
           </w:pPr>
-          <w:hyperlink w:anchor="_Toc231052490" w:history="1">
+          <w:hyperlink w:anchor="_Toc231054012" w:history="1">
             <w:r>
               <w:rPr>
                 <w:rStyle w:val="Hyperlink"/>
@@ -2872,7 +2852,7 @@
                 <w:noProof/>
                 <w:webHidden/>
               </w:rPr>
-              <w:instrText xml:space="preserve"> PAGEREF _Toc231052490 \h </w:instrText>
+              <w:instrText xml:space="preserve"> PAGEREF _Toc231054012 \h </w:instrText>
             </w:r>
             <w:r>
               <w:rPr>
@@ -2917,7 +2897,7 @@
               <w14:ligatures w14:val="standardContextual"/>
             </w:rPr>
           </w:pPr>
-          <w:hyperlink w:anchor="_Toc231052491" w:history="1">
+          <w:hyperlink w:anchor="_Toc231054013" w:history="1">
             <w:r>
               <w:rPr>
                 <w:rStyle w:val="Hyperlink"/>
@@ -2944,7 +2924,7 @@
                 <w:noProof/>
                 <w:webHidden/>
               </w:rPr>
-              <w:instrText xml:space="preserve"> PAGEREF _Toc231052491 \h </w:instrText>
+              <w:instrText xml:space="preserve"> PAGEREF _Toc231054013 \h </w:instrText>
             </w:r>
             <w:r>
               <w:rPr>
@@ -2989,7 +2969,7 @@
               <w14:ligatures w14:val="standardContextual"/>
             </w:rPr>
           </w:pPr>
-          <w:hyperlink w:anchor="_Toc231052492" w:history="1">
+          <w:hyperlink w:anchor="_Toc231054014" w:history="1">
             <w:r>
               <w:rPr>
                 <w:rStyle w:val="Hyperlink"/>
@@ -3016,7 +2996,7 @@
                 <w:noProof/>
                 <w:webHidden/>
               </w:rPr>
-              <w:instrText xml:space="preserve"> PAGEREF _Toc231052492 \h </w:instrText>
+              <w:instrText xml:space="preserve"> PAGEREF _Toc231054014 \h </w:instrText>
             </w:r>
             <w:r>
               <w:rPr>
@@ -3061,7 +3041,7 @@
               <w14:ligatures w14:val="standardContextual"/>
             </w:rPr>
           </w:pPr>
-          <w:hyperlink w:anchor="_Toc231052493" w:history="1">
+          <w:hyperlink w:anchor="_Toc231054015" w:history="1">
             <w:r>
               <w:rPr>
                 <w:rStyle w:val="Hyperlink"/>
@@ -3088,7 +3068,7 @@
                 <w:noProof/>
                 <w:webHidden/>
               </w:rPr>
-              <w:instrText xml:space="preserve"> PAGEREF _Toc231052493 \h </w:instrText>
+              <w:instrText xml:space="preserve"> PAGEREF _Toc231054015 \h </w:instrText>
             </w:r>
             <w:r>
               <w:rPr>
@@ -3133,7 +3113,7 @@
               <w14:ligatures w14:val="standardContextual"/>
             </w:rPr>
           </w:pPr>
-          <w:hyperlink w:anchor="_Toc231052494" w:history="1">
+          <w:hyperlink w:anchor="_Toc231054016" w:history="1">
             <w:r>
               <w:rPr>
                 <w:rStyle w:val="Hyperlink"/>
@@ -3160,7 +3140,7 @@
                 <w:noProof/>
                 <w:webHidden/>
               </w:rPr>
-              <w:instrText xml:space="preserve"> PAGEREF _Toc231052494 \h </w:instrText>
+              <w:instrText xml:space="preserve"> PAGEREF _Toc231054016 \h </w:instrText>
             </w:r>
             <w:r>
               <w:rPr>
@@ -3205,13 +3185,13 @@
               <w14:ligatures w14:val="standardContextual"/>
             </w:rPr>
           </w:pPr>
-          <w:hyperlink w:anchor="_Toc231052495" w:history="1">
+          <w:hyperlink w:anchor="_Toc231054017" w:history="1">
             <w:r>
               <w:rPr>
                 <w:rStyle w:val="Hyperlink"/>
                 <w:noProof/>
               </w:rPr>
-              <w:t>2. CƠ SỞ GIẢI QUYẾT BÀI TOÁN BẰNG THỊ GIÁC MÁY TÍNH</w:t>
+              <w:t>CHƯƠNG 2. CƠ SỞ GIẢI QUYẾT BÀI TOÁN BẰNG THỊ GIÁC MÁY TÍNH</w:t>
             </w:r>
             <w:r>
               <w:rPr>
@@ -3232,7 +3212,7 @@
                 <w:noProof/>
                 <w:webHidden/>
               </w:rPr>
-              <w:instrText xml:space="preserve"> PAGEREF _Toc231052495 \h </w:instrText>
+              <w:instrText xml:space="preserve"> PAGEREF _Toc231054017 \h </w:instrText>
             </w:r>
             <w:r>
               <w:rPr>
@@ -3277,7 +3257,7 @@
               <w14:ligatures w14:val="standardContextual"/>
             </w:rPr>
           </w:pPr>
-          <w:hyperlink w:anchor="_Toc231052496" w:history="1">
+          <w:hyperlink w:anchor="_Toc231054018" w:history="1">
             <w:r>
               <w:rPr>
                 <w:rStyle w:val="Hyperlink"/>
@@ -3304,7 +3284,7 @@
                 <w:noProof/>
                 <w:webHidden/>
               </w:rPr>
-              <w:instrText xml:space="preserve"> PAGEREF _Toc231052496 \h </w:instrText>
+              <w:instrText xml:space="preserve"> PAGEREF _Toc231054018 \h </w:instrText>
             </w:r>
             <w:r>
               <w:rPr>
@@ -3349,7 +3329,7 @@
               <w14:ligatures w14:val="standardContextual"/>
             </w:rPr>
           </w:pPr>
-          <w:hyperlink w:anchor="_Toc231052497" w:history="1">
+          <w:hyperlink w:anchor="_Toc231054019" w:history="1">
             <w:r>
               <w:rPr>
                 <w:rStyle w:val="Hyperlink"/>
@@ -3376,7 +3356,7 @@
                 <w:noProof/>
                 <w:webHidden/>
               </w:rPr>
-              <w:instrText xml:space="preserve"> PAGEREF _Toc231052497 \h </w:instrText>
+              <w:instrText xml:space="preserve"> PAGEREF _Toc231054019 \h </w:instrText>
             </w:r>
             <w:r>
               <w:rPr>
@@ -3421,7 +3401,7 @@
               <w14:ligatures w14:val="standardContextual"/>
             </w:rPr>
           </w:pPr>
-          <w:hyperlink w:anchor="_Toc231052498" w:history="1">
+          <w:hyperlink w:anchor="_Toc231054020" w:history="1">
             <w:r>
               <w:rPr>
                 <w:rStyle w:val="Hyperlink"/>
@@ -3448,7 +3428,7 @@
                 <w:noProof/>
                 <w:webHidden/>
               </w:rPr>
-              <w:instrText xml:space="preserve"> PAGEREF _Toc231052498 \h </w:instrText>
+              <w:instrText xml:space="preserve"> PAGEREF _Toc231054020 \h </w:instrText>
             </w:r>
             <w:r>
               <w:rPr>
@@ -3493,7 +3473,7 @@
               <w14:ligatures w14:val="standardContextual"/>
             </w:rPr>
           </w:pPr>
-          <w:hyperlink w:anchor="_Toc231052499" w:history="1">
+          <w:hyperlink w:anchor="_Toc231054021" w:history="1">
             <w:r>
               <w:rPr>
                 <w:rStyle w:val="Hyperlink"/>
@@ -3520,7 +3500,7 @@
                 <w:noProof/>
                 <w:webHidden/>
               </w:rPr>
-              <w:instrText xml:space="preserve"> PAGEREF _Toc231052499 \h </w:instrText>
+              <w:instrText xml:space="preserve"> PAGEREF _Toc231054021 \h </w:instrText>
             </w:r>
             <w:r>
               <w:rPr>
@@ -3565,7 +3545,7 @@
               <w14:ligatures w14:val="standardContextual"/>
             </w:rPr>
           </w:pPr>
-          <w:hyperlink w:anchor="_Toc231052500" w:history="1">
+          <w:hyperlink w:anchor="_Toc231054022" w:history="1">
             <w:r>
               <w:rPr>
                 <w:rStyle w:val="Hyperlink"/>
@@ -3592,7 +3572,7 @@
                 <w:noProof/>
                 <w:webHidden/>
               </w:rPr>
-              <w:instrText xml:space="preserve"> PAGEREF _Toc231052500 \h </w:instrText>
+              <w:instrText xml:space="preserve"> PAGEREF _Toc231054022 \h </w:instrText>
             </w:r>
             <w:r>
               <w:rPr>
@@ -3637,7 +3617,7 @@
               <w14:ligatures w14:val="standardContextual"/>
             </w:rPr>
           </w:pPr>
-          <w:hyperlink w:anchor="_Toc231052501" w:history="1">
+          <w:hyperlink w:anchor="_Toc231054023" w:history="1">
             <w:r>
               <w:rPr>
                 <w:rStyle w:val="Hyperlink"/>
@@ -3664,7 +3644,7 @@
                 <w:noProof/>
                 <w:webHidden/>
               </w:rPr>
-              <w:instrText xml:space="preserve"> PAGEREF _Toc231052501 \h </w:instrText>
+              <w:instrText xml:space="preserve"> PAGEREF _Toc231054023 \h </w:instrText>
             </w:r>
             <w:r>
               <w:rPr>
@@ -3709,7 +3689,7 @@
               <w14:ligatures w14:val="standardContextual"/>
             </w:rPr>
           </w:pPr>
-          <w:hyperlink w:anchor="_Toc231052502" w:history="1">
+          <w:hyperlink w:anchor="_Toc231054024" w:history="1">
             <w:r>
               <w:rPr>
                 <w:rStyle w:val="Hyperlink"/>
@@ -3736,7 +3716,7 @@
                 <w:noProof/>
                 <w:webHidden/>
               </w:rPr>
-              <w:instrText xml:space="preserve"> PAGEREF _Toc231052502 \h </w:instrText>
+              <w:instrText xml:space="preserve"> PAGEREF _Toc231054024 \h </w:instrText>
             </w:r>
             <w:r>
               <w:rPr>
@@ -3781,7 +3761,7 @@
               <w14:ligatures w14:val="standardContextual"/>
             </w:rPr>
           </w:pPr>
-          <w:hyperlink w:anchor="_Toc231052503" w:history="1">
+          <w:hyperlink w:anchor="_Toc231054025" w:history="1">
             <w:r>
               <w:rPr>
                 <w:rStyle w:val="Hyperlink"/>
@@ -3808,7 +3788,7 @@
                 <w:noProof/>
                 <w:webHidden/>
               </w:rPr>
-              <w:instrText xml:space="preserve"> PAGEREF _Toc231052503 \h </w:instrText>
+              <w:instrText xml:space="preserve"> PAGEREF _Toc231054025 \h </w:instrText>
             </w:r>
             <w:r>
               <w:rPr>
@@ -3853,13 +3833,13 @@
               <w14:ligatures w14:val="standardContextual"/>
             </w:rPr>
           </w:pPr>
-          <w:hyperlink w:anchor="_Toc231052504" w:history="1">
+          <w:hyperlink w:anchor="_Toc231054026" w:history="1">
             <w:r>
               <w:rPr>
                 <w:rStyle w:val="Hyperlink"/>
                 <w:noProof/>
               </w:rPr>
-              <w:t>3. KẾT QUẢ XỬ LÝ, NHẬN DẠNG BẰNG THỊ GIÁC MÁY TÍNH</w:t>
+              <w:t>CHƯƠNG 3. KẾT QUẢ XỬ LÝ, NHẬN DẠNG BẰNG THỊ GIÁC MÁY TÍNH</w:t>
             </w:r>
             <w:r>
               <w:rPr>
@@ -3880,7 +3860,7 @@
                 <w:noProof/>
                 <w:webHidden/>
               </w:rPr>
-              <w:instrText xml:space="preserve"> PAGEREF _Toc231052504 \h </w:instrText>
+              <w:instrText xml:space="preserve"> PAGEREF _Toc231054026 \h </w:instrText>
             </w:r>
             <w:r>
               <w:rPr>
@@ -3925,7 +3905,7 @@
               <w14:ligatures w14:val="standardContextual"/>
             </w:rPr>
           </w:pPr>
-          <w:hyperlink w:anchor="_Toc231052505" w:history="1">
+          <w:hyperlink w:anchor="_Toc231054027" w:history="1">
             <w:r>
               <w:rPr>
                 <w:rStyle w:val="Hyperlink"/>
@@ -3952,7 +3932,7 @@
                 <w:noProof/>
                 <w:webHidden/>
               </w:rPr>
-              <w:instrText xml:space="preserve"> PAGEREF _Toc231052505 \h </w:instrText>
+              <w:instrText xml:space="preserve"> PAGEREF _Toc231054027 \h </w:instrText>
             </w:r>
             <w:r>
               <w:rPr>
@@ -3997,7 +3977,7 @@
               <w14:ligatures w14:val="standardContextual"/>
             </w:rPr>
           </w:pPr>
-          <w:hyperlink w:anchor="_Toc231052506" w:history="1">
+          <w:hyperlink w:anchor="_Toc231054028" w:history="1">
             <w:r>
               <w:rPr>
                 <w:rStyle w:val="Hyperlink"/>
@@ -4024,7 +4004,7 @@
                 <w:noProof/>
                 <w:webHidden/>
               </w:rPr>
-              <w:instrText xml:space="preserve"> PAGEREF _Toc231052506 \h </w:instrText>
+              <w:instrText xml:space="preserve"> PAGEREF _Toc231054028 \h </w:instrText>
             </w:r>
             <w:r>
               <w:rPr>
@@ -4069,7 +4049,7 @@
               <w14:ligatures w14:val="standardContextual"/>
             </w:rPr>
           </w:pPr>
-          <w:hyperlink w:anchor="_Toc231052507" w:history="1">
+          <w:hyperlink w:anchor="_Toc231054029" w:history="1">
             <w:r>
               <w:rPr>
                 <w:rStyle w:val="Hyperlink"/>
@@ -4096,7 +4076,7 @@
                 <w:noProof/>
                 <w:webHidden/>
               </w:rPr>
-              <w:instrText xml:space="preserve"> PAGEREF _Toc231052507 \h </w:instrText>
+              <w:instrText xml:space="preserve"> PAGEREF _Toc231054029 \h </w:instrText>
             </w:r>
             <w:r>
               <w:rPr>
@@ -4141,7 +4121,7 @@
               <w14:ligatures w14:val="standardContextual"/>
             </w:rPr>
           </w:pPr>
-          <w:hyperlink w:anchor="_Toc231052508" w:history="1">
+          <w:hyperlink w:anchor="_Toc231054030" w:history="1">
             <w:r>
               <w:rPr>
                 <w:rStyle w:val="Hyperlink"/>
@@ -4168,7 +4148,7 @@
                 <w:noProof/>
                 <w:webHidden/>
               </w:rPr>
-              <w:instrText xml:space="preserve"> PAGEREF _Toc231052508 \h </w:instrText>
+              <w:instrText xml:space="preserve"> PAGEREF _Toc231054030 \h </w:instrText>
             </w:r>
             <w:r>
               <w:rPr>
@@ -4213,7 +4193,7 @@
               <w14:ligatures w14:val="standardContextual"/>
             </w:rPr>
           </w:pPr>
-          <w:hyperlink w:anchor="_Toc231052509" w:history="1">
+          <w:hyperlink w:anchor="_Toc231054031" w:history="1">
             <w:r>
               <w:rPr>
                 <w:rStyle w:val="Hyperlink"/>
@@ -4240,7 +4220,7 @@
                 <w:noProof/>
                 <w:webHidden/>
               </w:rPr>
-              <w:instrText xml:space="preserve"> PAGEREF _Toc231052509 \h </w:instrText>
+              <w:instrText xml:space="preserve"> PAGEREF _Toc231054031 \h </w:instrText>
             </w:r>
             <w:r>
               <w:rPr>
@@ -4285,7 +4265,7 @@
               <w14:ligatures w14:val="standardContextual"/>
             </w:rPr>
           </w:pPr>
-          <w:hyperlink w:anchor="_Toc231052510" w:history="1">
+          <w:hyperlink w:anchor="_Toc231054032" w:history="1">
             <w:r>
               <w:rPr>
                 <w:rStyle w:val="Hyperlink"/>
@@ -4312,7 +4292,7 @@
                 <w:noProof/>
                 <w:webHidden/>
               </w:rPr>
-              <w:instrText xml:space="preserve"> PAGEREF _Toc231052510 \h </w:instrText>
+              <w:instrText xml:space="preserve"> PAGEREF _Toc231054032 \h </w:instrText>
             </w:r>
             <w:r>
               <w:rPr>
@@ -4357,7 +4337,7 @@
               <w14:ligatures w14:val="standardContextual"/>
             </w:rPr>
           </w:pPr>
-          <w:hyperlink w:anchor="_Toc231052511" w:history="1">
+          <w:hyperlink w:anchor="_Toc231054033" w:history="1">
             <w:r>
               <w:rPr>
                 <w:rStyle w:val="Hyperlink"/>
@@ -4384,7 +4364,7 @@
                 <w:noProof/>
                 <w:webHidden/>
               </w:rPr>
-              <w:instrText xml:space="preserve"> PAGEREF _Toc231052511 \h </w:instrText>
+              <w:instrText xml:space="preserve"> PAGEREF _Toc231054033 \h </w:instrText>
             </w:r>
             <w:r>
               <w:rPr>
@@ -4429,7 +4409,7 @@
               <w14:ligatures w14:val="standardContextual"/>
             </w:rPr>
           </w:pPr>
-          <w:hyperlink w:anchor="_Toc231052512" w:history="1">
+          <w:hyperlink w:anchor="_Toc231054034" w:history="1">
             <w:r>
               <w:rPr>
                 <w:rStyle w:val="Hyperlink"/>
@@ -4456,7 +4436,7 @@
                 <w:noProof/>
                 <w:webHidden/>
               </w:rPr>
-              <w:instrText xml:space="preserve"> PAGEREF _Toc231052512 \h </w:instrText>
+              <w:instrText xml:space="preserve"> PAGEREF _Toc231054034 \h </w:instrText>
             </w:r>
             <w:r>
               <w:rPr>
@@ -4501,7 +4481,7 @@
               <w14:ligatures w14:val="standardContextual"/>
             </w:rPr>
           </w:pPr>
-          <w:hyperlink w:anchor="_Toc231052513" w:history="1">
+          <w:hyperlink w:anchor="_Toc231054035" w:history="1">
             <w:r>
               <w:rPr>
                 <w:rStyle w:val="Hyperlink"/>
@@ -4528,7 +4508,7 @@
                 <w:noProof/>
                 <w:webHidden/>
               </w:rPr>
-              <w:instrText xml:space="preserve"> PAGEREF _Toc231052513 \h </w:instrText>
+              <w:instrText xml:space="preserve"> PAGEREF _Toc231054035 \h </w:instrText>
             </w:r>
             <w:r>
               <w:rPr>
@@ -4573,7 +4553,7 @@
               <w14:ligatures w14:val="standardContextual"/>
             </w:rPr>
           </w:pPr>
-          <w:hyperlink w:anchor="_Toc231052514" w:history="1">
+          <w:hyperlink w:anchor="_Toc231054036" w:history="1">
             <w:r>
               <w:rPr>
                 <w:rStyle w:val="Hyperlink"/>
@@ -4600,7 +4580,7 @@
                 <w:noProof/>
                 <w:webHidden/>
               </w:rPr>
-              <w:instrText xml:space="preserve"> PAGEREF _Toc231052514 \h </w:instrText>
+              <w:instrText xml:space="preserve"> PAGEREF _Toc231054036 \h </w:instrText>
             </w:r>
             <w:r>
               <w:rPr>
@@ -4645,7 +4625,7 @@
               <w14:ligatures w14:val="standardContextual"/>
             </w:rPr>
           </w:pPr>
-          <w:hyperlink w:anchor="_Toc231052515" w:history="1">
+          <w:hyperlink w:anchor="_Toc231054037" w:history="1">
             <w:r>
               <w:rPr>
                 <w:rStyle w:val="Hyperlink"/>
@@ -4672,7 +4652,7 @@
                 <w:noProof/>
                 <w:webHidden/>
               </w:rPr>
-              <w:instrText xml:space="preserve"> PAGEREF _Toc231052515 \h </w:instrText>
+              <w:instrText xml:space="preserve"> PAGEREF _Toc231054037 \h </w:instrText>
             </w:r>
             <w:r>
               <w:rPr>
@@ -4740,7 +4720,7 @@
           <w:rFonts w:ascii="Times New Roman" w:hAnsi="Times New Roman" w:cs="Times New Roman"/>
         </w:rPr>
       </w:pPr>
-      <w:bookmarkStart w:id="0" w:name="_Toc231052485"/>
+      <w:bookmarkStart w:id="0" w:name="_Toc231054007"/>
       <w:r>
         <w:rPr>
           <w:rFonts w:ascii="Times New Roman" w:hAnsi="Times New Roman" w:cs="Times New Roman"/>
@@ -5315,7 +5295,7 @@
           <w:rFonts w:ascii="Times New Roman" w:hAnsi="Times New Roman" w:cs="Times New Roman"/>
         </w:rPr>
       </w:pPr>
-      <w:bookmarkStart w:id="1" w:name="_Toc231052486"/>
+      <w:bookmarkStart w:id="1" w:name="_Toc231054008"/>
       <w:r>
         <w:rPr>
           <w:rFonts w:ascii="Times New Roman" w:hAnsi="Times New Roman" w:cs="Times New Roman"/>
@@ -5507,7 +5487,7 @@
       <w:pPr>
         <w:pStyle w:val="Heading1"/>
       </w:pPr>
-      <w:bookmarkStart w:id="2" w:name="_Toc231052487"/>
+      <w:bookmarkStart w:id="2" w:name="_Toc231054009"/>
       <w:r>
         <w:rPr>
           <w:rFonts w:ascii="Times New Roman" w:eastAsia="Times New Roman" w:hAnsi="Times New Roman"/>
@@ -5620,7 +5600,7 @@
       <w:pPr>
         <w:pStyle w:val="Heading1"/>
       </w:pPr>
-      <w:bookmarkStart w:id="3" w:name="_Toc231052488"/>
+      <w:bookmarkStart w:id="3" w:name="_Toc231054010"/>
       <w:r>
         <w:rPr>
           <w:rFonts w:ascii="Times New Roman" w:eastAsia="Times New Roman" w:hAnsi="Times New Roman"/>
@@ -5672,13 +5652,20 @@
       <w:pPr>
         <w:pStyle w:val="Heading1"/>
       </w:pPr>
-      <w:bookmarkStart w:id="4" w:name="_Toc231052489"/>
+      <w:bookmarkStart w:id="4" w:name="_Toc231054011"/>
       <w:r>
         <w:rPr>
           <w:rFonts w:ascii="Times New Roman" w:eastAsia="Times New Roman" w:hAnsi="Times New Roman"/>
           <w:color w:val="000000"/>
         </w:rPr>
         <w:lastRenderedPageBreak/>
+        <w:t xml:space="preserve">CHƯƠNG </w:t>
+      </w:r>
+      <w:r>
+        <w:rPr>
+          <w:rFonts w:ascii="Times New Roman" w:eastAsia="Times New Roman" w:hAnsi="Times New Roman"/>
+          <w:color w:val="000000"/>
+        </w:rPr>
         <w:t>1. MÔ TẢ VẤN ĐỀ CỦA BÀI TOÁN</w:t>
       </w:r>
       <w:bookmarkEnd w:id="4"/>
@@ -5687,7 +5674,7 @@
       <w:pPr>
         <w:pStyle w:val="Heading2"/>
       </w:pPr>
-      <w:bookmarkStart w:id="5" w:name="_Toc231052490"/>
+      <w:bookmarkStart w:id="5" w:name="_Toc231054012"/>
       <w:r>
         <w:rPr>
           <w:rFonts w:ascii="Times New Roman" w:eastAsia="Times New Roman" w:hAnsi="Times New Roman"/>
@@ -5790,7 +5777,7 @@
       <w:pPr>
         <w:pStyle w:val="Heading2"/>
       </w:pPr>
-      <w:bookmarkStart w:id="6" w:name="_Toc231052491"/>
+      <w:bookmarkStart w:id="6" w:name="_Toc231054013"/>
       <w:r>
         <w:rPr>
           <w:rFonts w:ascii="Times New Roman" w:eastAsia="Times New Roman" w:hAnsi="Times New Roman"/>
@@ -6171,7 +6158,7 @@
       <w:pPr>
         <w:pStyle w:val="Heading2"/>
       </w:pPr>
-      <w:bookmarkStart w:id="9" w:name="_Toc231052492"/>
+      <w:bookmarkStart w:id="9" w:name="_Toc231054014"/>
       <w:r>
         <w:rPr>
           <w:rFonts w:ascii="Times New Roman" w:eastAsia="Times New Roman" w:hAnsi="Times New Roman"/>
@@ -6249,7 +6236,7 @@
       <w:pPr>
         <w:pStyle w:val="Heading2"/>
       </w:pPr>
-      <w:bookmarkStart w:id="10" w:name="_Toc231052493"/>
+      <w:bookmarkStart w:id="10" w:name="_Toc231054015"/>
       <w:r>
         <w:rPr>
           <w:rFonts w:ascii="Times New Roman" w:eastAsia="Times New Roman" w:hAnsi="Times New Roman"/>
@@ -6362,7 +6349,7 @@
       <w:pPr>
         <w:pStyle w:val="Heading2"/>
       </w:pPr>
-      <w:bookmarkStart w:id="11" w:name="_Toc231052494"/>
+      <w:bookmarkStart w:id="11" w:name="_Toc231054016"/>
       <w:r>
         <w:rPr>
           <w:rFonts w:ascii="Times New Roman" w:eastAsia="Times New Roman" w:hAnsi="Times New Roman"/>
@@ -6807,13 +6794,20 @@
       <w:pPr>
         <w:pStyle w:val="Heading1"/>
       </w:pPr>
-      <w:bookmarkStart w:id="14" w:name="_Toc231052495"/>
+      <w:bookmarkStart w:id="14" w:name="_Toc231054017"/>
       <w:r>
         <w:rPr>
           <w:rFonts w:ascii="Times New Roman" w:eastAsia="Times New Roman" w:hAnsi="Times New Roman"/>
           <w:color w:val="000000"/>
         </w:rPr>
         <w:lastRenderedPageBreak/>
+        <w:t xml:space="preserve">CHƯƠNG </w:t>
+      </w:r>
+      <w:r>
+        <w:rPr>
+          <w:rFonts w:ascii="Times New Roman" w:eastAsia="Times New Roman" w:hAnsi="Times New Roman"/>
+          <w:color w:val="000000"/>
+        </w:rPr>
         <w:t>2. CƠ SỞ GIẢI QUYẾT BÀI TOÁN BẰNG THỊ GIÁC MÁY TÍNH</w:t>
       </w:r>
       <w:bookmarkEnd w:id="14"/>
@@ -6822,7 +6816,7 @@
       <w:pPr>
         <w:pStyle w:val="Heading2"/>
       </w:pPr>
-      <w:bookmarkStart w:id="15" w:name="_Toc231052496"/>
+      <w:bookmarkStart w:id="15" w:name="_Toc231054018"/>
       <w:r>
         <w:rPr>
           <w:rFonts w:ascii="Times New Roman" w:eastAsia="Times New Roman" w:hAnsi="Times New Roman"/>
@@ -7208,7 +7202,7 @@
       <w:pPr>
         <w:pStyle w:val="Heading2"/>
       </w:pPr>
-      <w:bookmarkStart w:id="18" w:name="_Toc231052497"/>
+      <w:bookmarkStart w:id="18" w:name="_Toc231054019"/>
       <w:r>
         <w:rPr>
           <w:rFonts w:ascii="Times New Roman" w:eastAsia="Times New Roman" w:hAnsi="Times New Roman"/>
@@ -7271,7 +7265,7 @@
       <w:pPr>
         <w:pStyle w:val="Heading2"/>
       </w:pPr>
-      <w:bookmarkStart w:id="19" w:name="_Toc231052498"/>
+      <w:bookmarkStart w:id="19" w:name="_Toc231054020"/>
       <w:r>
         <w:rPr>
           <w:rFonts w:ascii="Times New Roman" w:eastAsia="Times New Roman" w:hAnsi="Times New Roman"/>
@@ -7341,7 +7335,7 @@
       <w:pPr>
         <w:pStyle w:val="Heading2"/>
       </w:pPr>
-      <w:bookmarkStart w:id="20" w:name="_Toc231052499"/>
+      <w:bookmarkStart w:id="20" w:name="_Toc231054021"/>
       <w:r>
         <w:rPr>
           <w:rFonts w:ascii="Times New Roman" w:eastAsia="Times New Roman" w:hAnsi="Times New Roman"/>
@@ -7395,7 +7389,7 @@
       <w:pPr>
         <w:pStyle w:val="Heading2"/>
       </w:pPr>
-      <w:bookmarkStart w:id="21" w:name="_Toc231052500"/>
+      <w:bookmarkStart w:id="21" w:name="_Toc231054022"/>
       <w:r>
         <w:rPr>
           <w:rFonts w:ascii="Times New Roman" w:eastAsia="Times New Roman" w:hAnsi="Times New Roman"/>
@@ -7484,7 +7478,7 @@
       <w:pPr>
         <w:pStyle w:val="Heading2"/>
       </w:pPr>
-      <w:bookmarkStart w:id="22" w:name="_Toc231052501"/>
+      <w:bookmarkStart w:id="22" w:name="_Toc231054023"/>
       <w:r>
         <w:rPr>
           <w:rFonts w:ascii="Times New Roman" w:eastAsia="Times New Roman" w:hAnsi="Times New Roman"/>
@@ -7757,7 +7751,7 @@
       <w:pPr>
         <w:pStyle w:val="Heading2"/>
       </w:pPr>
-      <w:bookmarkStart w:id="25" w:name="_Toc231052502"/>
+      <w:bookmarkStart w:id="25" w:name="_Toc231054024"/>
       <w:r>
         <w:rPr>
           <w:rFonts w:ascii="Times New Roman" w:eastAsia="Times New Roman" w:hAnsi="Times New Roman"/>
@@ -8036,7 +8030,7 @@
       <w:pPr>
         <w:pStyle w:val="Heading2"/>
       </w:pPr>
-      <w:bookmarkStart w:id="28" w:name="_Toc231052503"/>
+      <w:bookmarkStart w:id="28" w:name="_Toc231054025"/>
       <w:r>
         <w:rPr>
           <w:rFonts w:ascii="Times New Roman" w:eastAsia="Times New Roman" w:hAnsi="Times New Roman"/>
@@ -8095,13 +8089,20 @@
       <w:pPr>
         <w:pStyle w:val="Heading1"/>
       </w:pPr>
-      <w:bookmarkStart w:id="29" w:name="_Toc231052504"/>
+      <w:bookmarkStart w:id="29" w:name="_Toc231054026"/>
       <w:r>
         <w:rPr>
           <w:rFonts w:ascii="Times New Roman" w:eastAsia="Times New Roman" w:hAnsi="Times New Roman"/>
           <w:color w:val="000000"/>
         </w:rPr>
         <w:lastRenderedPageBreak/>
+        <w:t xml:space="preserve">CHƯƠNG </w:t>
+      </w:r>
+      <w:r>
+        <w:rPr>
+          <w:rFonts w:ascii="Times New Roman" w:eastAsia="Times New Roman" w:hAnsi="Times New Roman"/>
+          <w:color w:val="000000"/>
+        </w:rPr>
         <w:t>3. KẾT QUẢ XỬ LÝ, NHẬN DẠNG BẰNG THỊ GIÁC MÁY TÍNH</w:t>
       </w:r>
       <w:bookmarkEnd w:id="29"/>
@@ -8110,7 +8111,7 @@
       <w:pPr>
         <w:pStyle w:val="Heading2"/>
       </w:pPr>
-      <w:bookmarkStart w:id="30" w:name="_Toc231052505"/>
+      <w:bookmarkStart w:id="30" w:name="_Toc231054027"/>
       <w:r>
         <w:rPr>
           <w:rFonts w:ascii="Times New Roman" w:eastAsia="Times New Roman" w:hAnsi="Times New Roman"/>
@@ -8878,7 +8879,7 @@
       <w:pPr>
         <w:pStyle w:val="Heading2"/>
       </w:pPr>
-      <w:bookmarkStart w:id="33" w:name="_Toc231052506"/>
+      <w:bookmarkStart w:id="33" w:name="_Toc231054028"/>
       <w:r>
         <w:rPr>
           <w:rFonts w:ascii="Times New Roman" w:eastAsia="Times New Roman" w:hAnsi="Times New Roman"/>
@@ -8997,7 +8998,7 @@
       <w:pPr>
         <w:pStyle w:val="Heading2"/>
       </w:pPr>
-      <w:bookmarkStart w:id="34" w:name="_Toc231052507"/>
+      <w:bookmarkStart w:id="34" w:name="_Toc231054029"/>
       <w:r>
         <w:rPr>
           <w:rFonts w:ascii="Times New Roman" w:eastAsia="Times New Roman" w:hAnsi="Times New Roman"/>
@@ -9108,7 +9109,7 @@
       <w:pPr>
         <w:pStyle w:val="Heading2"/>
       </w:pPr>
-      <w:bookmarkStart w:id="35" w:name="_Toc231052508"/>
+      <w:bookmarkStart w:id="35" w:name="_Toc231054030"/>
       <w:r>
         <w:rPr>
           <w:rFonts w:ascii="Times New Roman" w:eastAsia="Times New Roman" w:hAnsi="Times New Roman"/>
@@ -9903,7 +9904,7 @@
       <w:pPr>
         <w:pStyle w:val="Heading2"/>
       </w:pPr>
-      <w:bookmarkStart w:id="40" w:name="_Toc231052509"/>
+      <w:bookmarkStart w:id="40" w:name="_Toc231054031"/>
       <w:r>
         <w:rPr>
           <w:rFonts w:ascii="Times New Roman" w:eastAsia="Times New Roman" w:hAnsi="Times New Roman"/>
@@ -10023,7 +10024,7 @@
       <w:pPr>
         <w:pStyle w:val="Heading2"/>
       </w:pPr>
-      <w:bookmarkStart w:id="41" w:name="_Toc231052510"/>
+      <w:bookmarkStart w:id="41" w:name="_Toc231054032"/>
       <w:r>
         <w:rPr>
           <w:rFonts w:ascii="Times New Roman" w:eastAsia="Times New Roman" w:hAnsi="Times New Roman"/>
@@ -10143,7 +10144,7 @@
       <w:pPr>
         <w:pStyle w:val="Heading2"/>
       </w:pPr>
-      <w:bookmarkStart w:id="42" w:name="_Toc231052511"/>
+      <w:bookmarkStart w:id="42" w:name="_Toc231054033"/>
       <w:r>
         <w:rPr>
           <w:rFonts w:ascii="Times New Roman" w:eastAsia="Times New Roman" w:hAnsi="Times New Roman"/>
@@ -10219,7 +10220,7 @@
       <w:pPr>
         <w:pStyle w:val="Heading1"/>
       </w:pPr>
-      <w:bookmarkStart w:id="43" w:name="_Toc231052512"/>
+      <w:bookmarkStart w:id="43" w:name="_Toc231054034"/>
       <w:r>
         <w:rPr>
           <w:rFonts w:ascii="Times New Roman" w:eastAsia="Times New Roman" w:hAnsi="Times New Roman"/>
@@ -10234,7 +10235,7 @@
       <w:pPr>
         <w:pStyle w:val="Heading2"/>
       </w:pPr>
-      <w:bookmarkStart w:id="44" w:name="_Toc231052513"/>
+      <w:bookmarkStart w:id="44" w:name="_Toc231054035"/>
       <w:r>
         <w:rPr>
           <w:rFonts w:ascii="Times New Roman" w:eastAsia="Times New Roman" w:hAnsi="Times New Roman"/>
@@ -10304,7 +10305,7 @@
       <w:pPr>
         <w:pStyle w:val="Heading2"/>
       </w:pPr>
-      <w:bookmarkStart w:id="45" w:name="_Toc231052514"/>
+      <w:bookmarkStart w:id="45" w:name="_Toc231054036"/>
       <w:r>
         <w:rPr>
           <w:rFonts w:ascii="Times New Roman" w:eastAsia="Times New Roman" w:hAnsi="Times New Roman"/>
@@ -10366,7 +10367,7 @@
       <w:pPr>
         <w:pStyle w:val="Heading1"/>
       </w:pPr>
-      <w:bookmarkStart w:id="46" w:name="_Toc231052515"/>
+      <w:bookmarkStart w:id="46" w:name="_Toc231054037"/>
       <w:r>
         <w:rPr>
           <w:rFonts w:ascii="Times New Roman" w:eastAsia="Times New Roman" w:hAnsi="Times New Roman"/>

</xml_diff>